<commit_message>
Sefaria verification pass on 2026-07-19: upgrade fn18 citation
Pilot run of the new Sefaria-verification agent (Option A, added to weekly
workflow 2026-07-23). Ran the verification on 2026-07-19 shiur's academic-note
flags. Result:

- fn18 (sixty letters of Birkat Kohanim = sixty giborim): VERIFIED and citation
  upgraded from placeholder 'traditional מפרשים and מקובלים' to specific named
  source — Bamidbar Rabbah 11:3, R' Samlai's drasha. Note-academic flag removed.
  Both English and Hebrew versions updated with the same citation.

- fn5 (Rav Asher Weiss on HaMapil): UNCERTAIN, correctly preserved. Sefaria
  does not index modern responsa (Minchat Asher). Flag kept.

DOCX regenerated for both English and Hebrew after HTML update.

This is the first cite-verification pass in the archive. Going forward, every
Sunday scheduled run will include this step automatically.
</commit_message>
<xml_diff>
--- a/2026-07-19 — הַמַּפִּיל, Hareini Mochel, and the Maharam's Prison Seder — styled.docx
+++ b/2026-07-19 — הַמַּפִּיל, Hareini Mochel, and the Maharam's Prison Seder — styled.docx
@@ -5964,7 +5964,27 @@
                 <w:color w:val="3B3B3B"/>
                 <w:sz w:val="20"/>
               </w:rPr>
-              <w:t>. Verify the specific citation before referencing in a formal halachic context.</w:t>
+              <w:t xml:space="preserve">. Verify the specific citation before referencing in a formal halachic context. (Checked via Sefaria API 2026-07-23: </w:t>
+            </w:r>
+            <w:r>
+              <w:rPr>
+                <w:rFonts w:ascii="Georgia" w:hAnsi="Georgia" w:cs="SBL Hebrew" w:eastAsia="Georgia"/>
+                <w:b w:val="0"/>
+                <w:i/>
+                <w:color w:val="3B3B3B"/>
+                <w:sz w:val="20"/>
+              </w:rPr>
+              <w:t>מנחת אשר</w:t>
+            </w:r>
+            <w:r>
+              <w:rPr>
+                <w:rFonts w:ascii="Georgia" w:hAnsi="Georgia" w:cs="SBL Hebrew" w:eastAsia="Georgia"/>
+                <w:b w:val="0"/>
+                <w:i w:val="0"/>
+                <w:color w:val="3B3B3B"/>
+                <w:sz w:val="20"/>
+              </w:rPr>
+              <w:t xml:space="preserve"> and Rav Asher Weiss's published shiurim are not indexed in Sefaria's corpus; the specific citation is outside Sefaria coverage.)</w:t>
             </w:r>
           </w:p>
         </w:tc>
@@ -6993,11 +7013,11 @@
         <w:rPr>
           <w:rFonts w:ascii="Georgia" w:hAnsi="Georgia" w:cs="SBL Hebrew" w:eastAsia="Georgia"/>
           <w:b w:val="0"/>
-          <w:i w:val="0"/>
+          <w:i/>
           <w:color w:val="1A1A1A"/>
           <w:sz w:val="21"/>
         </w:rPr>
-        <w:t>The counting of sixty letters in ברכת כהנים — traditional מפרשים and מקובלים.</w:t>
+        <w:t>במדבר רבה י"א:ג'</w:t>
       </w:r>
       <w:r>
         <w:rPr>
@@ -7007,49 +7027,98 @@
           <w:color w:val="1A1A1A"/>
           <w:sz w:val="21"/>
         </w:rPr>
-        <w:t>— The tradition of counting exactly sixty letters in the three-verse ברכת כהנים and mapping them onto the sixty גיבורים of שיר השירים ג' פסוק ז' (see fn19) is preserved across several מפרשים and מקובלים. The count depends on specific orthographic traditions and pronunciation conventions; different letter-counting systems produce slightly different totals, and the "sixty" is preserved by the most widely-accepted count. The mapping serves the structural claim that saying ברכת כהנים at bedtime places sixty spiritual גיבורים around the sleeper's bed. Exact source in the מפרשים not specified in the שיעור.</w:t>
-      </w:r>
-    </w:p>
-    <w:tbl>
-      <w:tblPr>
-        <w:tblW w:type="auto" w:w="0"/>
-        <w:tblLook w:firstColumn="1" w:firstRow="1" w:lastColumn="0" w:lastRow="0" w:noHBand="0" w:noVBand="1" w:val="04A0"/>
-        <w:tblInd w:w="480" w:type="dxa"/>
-      </w:tblPr>
-      <w:tblGrid>
-        <w:gridCol w:w="9406"/>
-      </w:tblGrid>
-      <w:tr>
-        <w:tc>
-          <w:tcPr>
-            <w:tcW w:type="dxa" w:w="8220"/>
-            <w:shd w:val="clear" w:color="auto" w:fill="faf3df"/>
-            <w:tcBorders>
-              <w:left w:val="single" w:sz="10" w:color="d4a017"/>
-            </w:tcBorders>
-          </w:tcPr>
-          <w:p>
-            <w:pPr>
-              <w:spacing w:before="0" w:after="0" w:line="312" w:lineRule="auto"/>
-            </w:pPr>
-            <w:r>
-              <w:rPr>
-                <w:rFonts w:ascii="Georgia" w:hAnsi="Georgia" w:cs="SBL Hebrew" w:eastAsia="Georgia"/>
-                <w:b w:val="0"/>
-                <w:i w:val="0"/>
-                <w:color w:val="3B3B3B"/>
-                <w:sz w:val="20"/>
-              </w:rPr>
-              <w:t>The letter-count of ברכת כהנים as exactly sixty depends on specific orthographic and pronunciation conventions and does not hold under all counting systems. The tradition is preserved across multiple מפרשים but the specific source for the "60 letters = 60 giborim" derasha was not identified in the שיעור. Verify against standard sources on the גימטריה and letter-counts of ברכת כהנים before citing formally.</w:t>
-            </w:r>
-          </w:p>
-        </w:tc>
-      </w:tr>
-    </w:tbl>
-    <w:p>
-      <w:pPr>
-        <w:spacing w:before="0" w:after="80"/>
-      </w:pPr>
+        <w:t xml:space="preserve"> — "ששים גבורים סביב לה — אלו ששים אותיות שבברכת כהנים" (ר' שמלאי).</w:t>
+      </w:r>
+      <w:r>
+        <w:rPr>
+          <w:rFonts w:ascii="Georgia" w:hAnsi="Georgia" w:cs="SBL Hebrew" w:eastAsia="Georgia"/>
+          <w:b w:val="0"/>
+          <w:i w:val="0"/>
+          <w:color w:val="1A1A1A"/>
+          <w:sz w:val="21"/>
+        </w:rPr>
+        <w:t xml:space="preserve">— The primary chazal-mekor for the derasha equating the sixty warriors of שיר השירים ג' פסוק ז' with the sixty letters of ברכת כהנים is </w:t>
+      </w:r>
+      <w:r>
+        <w:rPr>
+          <w:rFonts w:ascii="Georgia" w:hAnsi="Georgia" w:cs="SBL Hebrew" w:eastAsia="Georgia"/>
+          <w:b/>
+          <w:i w:val="0"/>
+          <w:color w:val="1A1A1A"/>
+          <w:sz w:val="21"/>
+        </w:rPr>
+        <w:t>במדבר רבה פרשה י"א סימן ג'</w:t>
+      </w:r>
+      <w:r>
+        <w:rPr>
+          <w:rFonts w:ascii="Georgia" w:hAnsi="Georgia" w:cs="SBL Hebrew" w:eastAsia="Georgia"/>
+          <w:b w:val="0"/>
+          <w:i w:val="0"/>
+          <w:color w:val="1A1A1A"/>
+          <w:sz w:val="21"/>
+        </w:rPr>
+        <w:t xml:space="preserve">, in the extended דרשה of </w:t>
+      </w:r>
+      <w:r>
+        <w:rPr>
+          <w:rFonts w:ascii="Georgia" w:hAnsi="Georgia" w:cs="SBL Hebrew" w:eastAsia="Georgia"/>
+          <w:b/>
+          <w:i w:val="0"/>
+          <w:color w:val="1A1A1A"/>
+          <w:sz w:val="21"/>
+        </w:rPr>
+        <w:t>ר' שמלאי</w:t>
+      </w:r>
+      <w:r>
+        <w:rPr>
+          <w:rFonts w:ascii="Georgia" w:hAnsi="Georgia" w:cs="SBL Hebrew" w:eastAsia="Georgia"/>
+          <w:b w:val="0"/>
+          <w:i w:val="0"/>
+          <w:color w:val="1A1A1A"/>
+          <w:sz w:val="21"/>
+        </w:rPr>
+        <w:t xml:space="preserve"> on the פרשה of ברכת כהנים. On the phrase </w:t>
+      </w:r>
+      <w:r>
+        <w:rPr>
+          <w:rFonts w:ascii="Georgia" w:hAnsi="Georgia" w:cs="SBL Hebrew" w:eastAsia="Georgia"/>
+          <w:b w:val="0"/>
+          <w:i/>
+          <w:color w:val="1A1A1A"/>
+          <w:sz w:val="21"/>
+        </w:rPr>
+        <w:t>ששים גבורים סביב לה</w:t>
+      </w:r>
+      <w:r>
+        <w:rPr>
+          <w:rFonts w:ascii="Georgia" w:hAnsi="Georgia" w:cs="SBL Hebrew" w:eastAsia="Georgia"/>
+          <w:b w:val="0"/>
+          <w:i w:val="0"/>
+          <w:color w:val="1A1A1A"/>
+          <w:sz w:val="21"/>
+        </w:rPr>
+        <w:t xml:space="preserve">, the midrash states explicitly: </w:t>
+      </w:r>
+      <w:r>
+        <w:rPr>
+          <w:rFonts w:ascii="Georgia" w:hAnsi="Georgia" w:cs="SBL Hebrew" w:eastAsia="Georgia"/>
+          <w:b w:val="0"/>
+          <w:i/>
+          <w:color w:val="1A1A1A"/>
+          <w:sz w:val="21"/>
+        </w:rPr>
+        <w:t>אלו ששים אותיות שבברכת כהנים</w:t>
+      </w:r>
+      <w:r>
+        <w:rPr>
+          <w:rFonts w:ascii="Georgia" w:hAnsi="Georgia" w:cs="SBL Hebrew" w:eastAsia="Georgia"/>
+          <w:b w:val="0"/>
+          <w:i w:val="0"/>
+          <w:color w:val="1A1A1A"/>
+          <w:sz w:val="21"/>
+        </w:rPr>
+        <w:t xml:space="preserve"> — these are the sixty letters of the Priestly Benediction. The same דרשה continues that even one who dreams a sword is cutting his thigh should rise early to hear ברכת כהנים and no harm will come to him — grounding the nightly-שמירה application. The specific letter-count of exactly sixty depends on standard orthographic conventions (יְבָרֶכְךָ... וְיִשְׁמְרֶךָ / יָאֵר... וִיחֻנֶּךָּ / יִשָּׂא... וְיָשֵׂם לְךָ שָׁלוֹם); different counting systems produce slightly different totals, and the "sixty" is preserved by the count assumed by the Midrash Rabbah itself.</w:t>
+      </w:r>
     </w:p>
     <w:p>
       <w:pPr>

</xml_diff>